<commit_message>
v0.3: explain analysis logic before main results
Co-Authored-By: Claude Opus 5.5 <noreply@anthropic.com>
Claude-Session: https://claude.ai/code/session_012DTSJ2m8Qh2XXyQak2q185
</commit_message>
<xml_diff>
--- a/innovation_talent/docs/创新人才识别模型_v0.3.docx
+++ b/innovation_talent/docs/创新人才识别模型_v0.3.docx
@@ -98,7 +98,323 @@
         <w:pStyle w:val="Heading3"/>
       </w:pPr>
       <w:r>
-        <w:t>1.3 主要结果</w:t>
+        <w:t>1.3 分析思路</w:t>
+      </w:r>
+    </w:p>
+    <w:p>
+      <w:r>
+        <w:t>一套识别指标要能投入使用，须依次通过三项检验，每项对应模型的一个组成部分；前一项不成立，后一项便无从谈起。</w:t>
+      </w:r>
+    </w:p>
+    <w:tbl>
+      <w:tblPr>
+        <w:tblStyle w:val="TableGrid"/>
+        <w:tblW w:type="auto" w:w="0"/>
+        <w:tblLook w:firstColumn="1" w:firstRow="1" w:lastColumn="0" w:lastRow="0" w:noHBand="0" w:noVBand="1" w:val="04A0"/>
+      </w:tblPr>
+      <w:tblGrid>
+        <w:gridCol w:w="2160"/>
+        <w:gridCol w:w="2160"/>
+        <w:gridCol w:w="2160"/>
+        <w:gridCol w:w="2160"/>
+      </w:tblGrid>
+      <w:tr>
+        <w:tc>
+          <w:tcPr>
+            <w:tcW w:type="dxa" w:w="2160"/>
+          </w:tcPr>
+          <w:p>
+            <w:r/>
+            <w:r>
+              <w:rPr>
+                <w:b/>
+                <w:sz w:val="18"/>
+              </w:rPr>
+              <w:t>检验</w:t>
+            </w:r>
+          </w:p>
+        </w:tc>
+        <w:tc>
+          <w:tcPr>
+            <w:tcW w:type="dxa" w:w="2160"/>
+          </w:tcPr>
+          <w:p>
+            <w:r/>
+            <w:r>
+              <w:rPr>
+                <w:b/>
+                <w:sz w:val="18"/>
+              </w:rPr>
+              <w:t>对应模型部分</w:t>
+            </w:r>
+          </w:p>
+        </w:tc>
+        <w:tc>
+          <w:tcPr>
+            <w:tcW w:type="dxa" w:w="2160"/>
+          </w:tcPr>
+          <w:p>
+            <w:r/>
+            <w:r>
+              <w:rPr>
+                <w:b/>
+                <w:sz w:val="18"/>
+              </w:rPr>
+              <w:t>为什么要检验</w:t>
+            </w:r>
+          </w:p>
+        </w:tc>
+        <w:tc>
+          <w:tcPr>
+            <w:tcW w:type="dxa" w:w="2160"/>
+          </w:tcPr>
+          <w:p>
+            <w:r/>
+            <w:r>
+              <w:rPr>
+                <w:b/>
+                <w:sz w:val="18"/>
+              </w:rPr>
+              <w:t>检验方法</w:t>
+            </w:r>
+          </w:p>
+        </w:tc>
+      </w:tr>
+      <w:tr>
+        <w:tc>
+          <w:tcPr>
+            <w:tcW w:type="dxa" w:w="2160"/>
+          </w:tcPr>
+          <w:p>
+            <w:r>
+              <w:rPr>
+                <w:sz w:val="18"/>
+              </w:rPr>
+            </w:r>
+            <w:r>
+              <w:rPr>
+                <w:sz w:val="18"/>
+              </w:rPr>
+              <w:t>看得见：指标能否在叙述中找到行为证据</w:t>
+            </w:r>
+          </w:p>
+        </w:tc>
+        <w:tc>
+          <w:tcPr>
+            <w:tcW w:type="dxa" w:w="2160"/>
+          </w:tcPr>
+          <w:p>
+            <w:r>
+              <w:rPr>
+                <w:sz w:val="18"/>
+              </w:rPr>
+            </w:r>
+            <w:r>
+              <w:rPr>
+                <w:sz w:val="18"/>
+              </w:rPr>
+              <w:t>指标</w:t>
+            </w:r>
+          </w:p>
+        </w:tc>
+        <w:tc>
+          <w:tcPr>
+            <w:tcW w:type="dxa" w:w="2160"/>
+          </w:tcPr>
+          <w:p>
+            <w:r>
+              <w:rPr>
+                <w:sz w:val="18"/>
+              </w:rPr>
+            </w:r>
+            <w:r>
+              <w:rPr>
+                <w:sz w:val="18"/>
+              </w:rPr>
+              <w:t>测不到的指标无法计分，这是后续一切分析的前提</w:t>
+            </w:r>
+          </w:p>
+        </w:tc>
+        <w:tc>
+          <w:tcPr>
+            <w:tcW w:type="dxa" w:w="2160"/>
+          </w:tcPr>
+          <w:p>
+            <w:r>
+              <w:rPr>
+                <w:sz w:val="18"/>
+              </w:rPr>
+            </w:r>
+            <w:r>
+              <w:rPr>
+                <w:sz w:val="18"/>
+              </w:rPr>
+              <w:t>各指标有行为证据的人数比例；“仅声明”判断所占比例</w:t>
+            </w:r>
+          </w:p>
+        </w:tc>
+      </w:tr>
+      <w:tr>
+        <w:tc>
+          <w:tcPr>
+            <w:tcW w:type="dxa" w:w="2160"/>
+          </w:tcPr>
+          <w:p>
+            <w:r>
+              <w:rPr>
+                <w:sz w:val="18"/>
+              </w:rPr>
+            </w:r>
+            <w:r>
+              <w:rPr>
+                <w:sz w:val="18"/>
+              </w:rPr>
+              <w:t>分得开：指标是否按六个维度聚合</w:t>
+            </w:r>
+          </w:p>
+        </w:tc>
+        <w:tc>
+          <w:tcPr>
+            <w:tcW w:type="dxa" w:w="2160"/>
+          </w:tcPr>
+          <w:p>
+            <w:r>
+              <w:rPr>
+                <w:sz w:val="18"/>
+              </w:rPr>
+            </w:r>
+            <w:r>
+              <w:rPr>
+                <w:sz w:val="18"/>
+              </w:rPr>
+              <w:t>维度</w:t>
+            </w:r>
+          </w:p>
+        </w:tc>
+        <w:tc>
+          <w:tcPr>
+            <w:tcW w:type="dxa" w:w="2160"/>
+          </w:tcPr>
+          <w:p>
+            <w:r>
+              <w:rPr>
+                <w:sz w:val="18"/>
+              </w:rPr>
+            </w:r>
+            <w:r>
+              <w:rPr>
+                <w:sz w:val="18"/>
+              </w:rPr>
+              <w:t>模型按维度计分、按维度赋权，须先证明维度是可区分的整体</w:t>
+            </w:r>
+          </w:p>
+        </w:tc>
+        <w:tc>
+          <w:tcPr>
+            <w:tcW w:type="dxa" w:w="2160"/>
+          </w:tcPr>
+          <w:p>
+            <w:r>
+              <w:rPr>
+                <w:sz w:val="18"/>
+              </w:rPr>
+            </w:r>
+            <w:r>
+              <w:rPr>
+                <w:sz w:val="18"/>
+              </w:rPr>
+              <w:t>同维与跨维相关比较；平行分析确定因子数；验证性因素分析；内部一致性</w:t>
+            </w:r>
+          </w:p>
+        </w:tc>
+      </w:tr>
+      <w:tr>
+        <w:tc>
+          <w:tcPr>
+            <w:tcW w:type="dxa" w:w="2160"/>
+          </w:tcPr>
+          <w:p>
+            <w:r>
+              <w:rPr>
+                <w:sz w:val="18"/>
+              </w:rPr>
+            </w:r>
+            <w:r>
+              <w:rPr>
+                <w:sz w:val="18"/>
+              </w:rPr>
+              <w:t>有秩序：证据的出现是否符合阶段假设</w:t>
+            </w:r>
+          </w:p>
+        </w:tc>
+        <w:tc>
+          <w:tcPr>
+            <w:tcW w:type="dxa" w:w="2160"/>
+          </w:tcPr>
+          <w:p>
+            <w:r>
+              <w:rPr>
+                <w:sz w:val="18"/>
+              </w:rPr>
+            </w:r>
+            <w:r>
+              <w:rPr>
+                <w:sz w:val="18"/>
+              </w:rPr>
+              <w:t>阶段相关度</w:t>
+            </w:r>
+          </w:p>
+        </w:tc>
+        <w:tc>
+          <w:tcPr>
+            <w:tcW w:type="dxa" w:w="2160"/>
+          </w:tcPr>
+          <w:p>
+            <w:r>
+              <w:rPr>
+                <w:sz w:val="18"/>
+              </w:rPr>
+            </w:r>
+            <w:r>
+              <w:rPr>
+                <w:sz w:val="18"/>
+              </w:rPr>
+              <w:t>模型的核心主张是指标的重要性随发展阶段变化</w:t>
+            </w:r>
+          </w:p>
+        </w:tc>
+        <w:tc>
+          <w:tcPr>
+            <w:tcW w:type="dxa" w:w="2160"/>
+          </w:tcPr>
+          <w:p>
+            <w:r>
+              <w:rPr>
+                <w:sz w:val="18"/>
+              </w:rPr>
+            </w:r>
+            <w:r>
+              <w:rPr>
+                <w:sz w:val="18"/>
+              </w:rPr>
+              <w:t>各指标证据在人生阶段上的分布与先验方向对照；学生组内本科生与研究生比较</w:t>
+            </w:r>
+          </w:p>
+        </w:tc>
+      </w:tr>
+    </w:tbl>
+    <w:p/>
+    <w:p>
+      <w:r>
+        <w:t>此外比较两组的构成差异，用以判断差异来自群体本身还是来自文体（自传与表彰报道），这决定得主组能否作为学生组的参照。</w:t>
+      </w:r>
+    </w:p>
+    <w:p>
+      <w:pPr>
+        <w:pStyle w:val="Heading3"/>
+      </w:pPr>
+      <w:r>
+        <w:t>1.4 主要结果</w:t>
       </w:r>
     </w:p>
     <w:p>
@@ -109,10 +425,10 @@
         <w:rPr>
           <w:b/>
         </w:rPr>
-        <w:t>可观测性</w:t>
+        <w:t>看得见：部分成立。</w:t>
       </w:r>
       <w:r>
-        <w:t>：得主组 22 项指标在三成以上个体中有行为证据；问题新颖性、休息后的顿悟、作品修改增益等 5 项几乎不出现；方向与认同类指标以表态为主。</w:t>
+        <w:t xml:space="preserve"> 得主组 22 项指标在三成以上个体中有行为证据；问题新颖性、休息后的顿悟、作品修改增益等 5 项几乎不出现；方向与认同类指标以表态为主。文本适合测量多数指标，但不是全部（→ 修订二，第 3 节）。</w:t>
       </w:r>
     </w:p>
     <w:p>
@@ -123,10 +439,10 @@
         <w:rPr>
           <w:b/>
         </w:rPr>
-        <w:t>结构</w:t>
+        <w:t>分得开：不成立。</w:t>
       </w:r>
       <w:r>
-        <w:t>：同维相关仅略高于跨维（.105 比 .081）；因子个数在 2 至 8 之间不定；六因子模型 CFI = .812；维度内部一致性 .42—.65。数据更接近“问题发现与求解”“方向、动机与投入”两个内容簇。</w:t>
+        <w:t xml:space="preserve"> 同维相关仅略高于跨维（.105 比 .081）；因子个数在 2 至 8 之间不定；六因子模型 CFI = .812；维度内部一致性 .42—.65。数据更接近“问题发现与求解”“方向、动机与投入”两个内容簇，六个维度不能分别计分（→ 修订一，第 2 节）。</w:t>
       </w:r>
     </w:p>
     <w:p>
@@ -137,10 +453,10 @@
         <w:rPr>
           <w:b/>
         </w:rPr>
-        <w:t>发展</w:t>
+        <w:t>有秩序：大体成立。</w:t>
       </w:r>
       <w:r>
-        <w:t>：21 项可判断方向的指标中 15 项与先验一致；方向与认同类指标峰值在本科。</w:t>
+        <w:t xml:space="preserve"> 21 项可判断方向的指标中 15 项与先验一致；方向与认同类指标的峰值在本科，学生组内研究生的方向类证据也少于本科生（0.61 倍），提示这类指标呈窗口型而非递增型（→ 修订三，第 4 节）。研究生的好奇与探索类证据为本科生的 0.25 倍，与“探索随阶段下降”的先验一致。</w:t>
       </w:r>
     </w:p>
     <w:p>
@@ -151,10 +467,10 @@
         <w:rPr>
           <w:b/>
         </w:rPr>
-        <w:t>群体与学历</w:t>
+        <w:t>群体差异：主要来自文体。</w:t>
       </w:r>
       <w:r>
-        <w:t>：两组构成高度相似（ρ = .84），差异方向与文体惯例吻合；学生组内研究生的好奇与探索类证据为本科生的 0.25 倍。</w:t>
+        <w:t xml:space="preserve"> 两组构成高度相似（ρ = .84）；学生组偏重坚持与投入，得主组偏重探索与判断，与表彰报道和自传各自的叙述惯例吻合，不宜读作能力差异。出现率不能直接用于赋权（→ 第 5 节）。</w:t>
       </w:r>
     </w:p>
     <w:p>

</xml_diff>